<commit_message>
GBCO update doc: explain how the SOTP framings table maps to the lens table's bear/base/full scenarios (reader question)
Co-Authored-By: Claude Fable 5 <noreply@anthropic.com>
Claude-Session: https://claude.ai/code/session_01GUJ9nzbojRiyNPFGcFkCJV
</commit_message>
<xml_diff>
--- a/files/GBCO_Valuation_Update_30-08-2026.docx
+++ b/files/GBCO_Valuation_Update_30-08-2026.docx
@@ -5836,6 +5836,24 @@
           <w:szCs w:val="21"/>
         </w:rPr>
         <w:t xml:space="preserve"/>
+      </w:r>
+    </w:p>
+    <w:p>
+      <w:pPr>
+        <w:spacing w:after="120" w:before="0"/>
+      </w:pPr>
+      <w:r>
+        <w:rPr>
+          <w:rFonts w:ascii="Georgia" w:cs="Georgia" w:eastAsia="Georgia" w:hAnsi="Georgia"/>
+          <w:b w:val="false"/>
+          <w:bCs w:val="false"/>
+          <w:i w:val="false"/>
+          <w:iCs w:val="false"/>
+          <w:color w:val="6B7C78"/>
+          <w:sz w:val="21"/>
+          <w:szCs w:val="21"/>
+        </w:rPr>
+        <w:t xml:space="preserve">How to read this table against the lens table below: rows A and B change ONE thing only — the MNT-Halan framing — with the car business and the lender held at their base values in both. The 'Sum of the parts' row in the lens table is a full scenario per column: its Base equals Total (B); its Bear starts from framing A and additionally stresses the operating legs (car business at 60% of its DCF value, lender at 0.8× book), which is why it sits below Total (A); its Full flexes the operating legs up (×1.4) and marks the stake at the post-second-closing round value grown to a next mark.</w:t>
       </w:r>
     </w:p>
     <w:p>

</xml_diff>

<commit_message>
GBCO update doc: SOTP section rebuilt as a single per-scenario reconciliation table (legs -> sum -> per share -> 10% discount -> total); lens rows renamed to name the discount; presentation only, no valuation change
Co-Authored-By: Claude Fable 5 <noreply@anthropic.com>
Claude-Session: https://claude.ai/code/session_01GUJ9nzbojRiyNPFGcFkCJV
</commit_message>
<xml_diff>
--- a/files/GBCO_Valuation_Update_30-08-2026.docx
+++ b/files/GBCO_Valuation_Update_30-08-2026.docx
@@ -5087,7 +5087,7 @@
           <w:sz w:val="30"/>
           <w:szCs w:val="30"/>
         </w:rPr>
-        <w:t xml:space="preserve">Sum of the parts — and the judgement that drives it</w:t>
+        <w:t xml:space="preserve">Sum of the parts — one table, every step</w:t>
       </w:r>
     </w:p>
     <w:p>
@@ -5105,12 +5105,12 @@
           <w:sz w:val="21"/>
           <w:szCs w:val="21"/>
         </w:rPr>
-        <w:t xml:space="preserve">GB Corp is three businesses in one listing: an automotive assembler-distributor, a non-bank lender, and a 42.93% stake in MNT-Halan (41.61% once the announced second closing completes). The stake's value is the update's most consequential contested judgement, so it is computed both ways and shown side by side — never averaged.</w:t>
+        <w:t xml:space="preserve">GB Corp is three businesses in one listing: an automotive assembler-distributor, a non-bank lender, and a 42.93% stake in MNT-Halan (41.61% once the announced second closing completes). The table below shows every scenario as one column, top to bottom: value each piece, add them up, state it per share, apply the 10% holding-company discount (conglomerates usually trade below the sum of their pieces), and state the total per share. The two Base columns differ in ONE thing — what the MNT-Halan stake is worth: its audited book value (framing A) or the price Al Ahly Capital actually paid in the June 2026 funding round (framing B). We show both and never average them; the update's central case stands on the round price, the bear case on book.</w:t>
       </w:r>
     </w:p>
     <w:tbl>
       <w:tblPr>
-        <w:tblW w:type="dxa" w:w="10400"/>
+        <w:tblW w:type="dxa" w:w="10300"/>
         <w:tblBorders>
           <w:top w:val="single" w:color="DCE4E2" w:sz="4"/>
           <w:left w:val="none"/>
@@ -5121,9 +5121,11 @@
         </w:tblBorders>
       </w:tblPr>
       <w:tblGrid>
-        <w:gridCol w:w="4200"/>
-        <w:gridCol w:w="1700"/>
-        <w:gridCol w:w="4500"/>
+        <w:gridCol w:w="3100"/>
+        <w:gridCol w:w="1650"/>
+        <w:gridCol w:w="1900"/>
+        <w:gridCol w:w="2000"/>
+        <w:gridCol w:w="1650"/>
       </w:tblGrid>
       <w:tr>
         <w:trPr>
@@ -5131,7 +5133,7 @@
         </w:trPr>
         <w:tc>
           <w:tcPr>
-            <w:tcW w:type="dxa" w:w="4200"/>
+            <w:tcW w:type="dxa" w:w="3100"/>
             <w:shd w:fill="F4F1EA" w:val="clear"/>
             <w:tcMar>
               <w:top w:type="dxa" w:w="60"/>
@@ -5154,13 +5156,13 @@
                 <w:sz w:val="19"/>
                 <w:szCs w:val="19"/>
               </w:rPr>
-              <w:t xml:space="preserve">Leg (EGP mn, parent share)</w:t>
-            </w:r>
-          </w:p>
-        </w:tc>
-        <w:tc>
-          <w:tcPr>
-            <w:tcW w:type="dxa" w:w="1700"/>
+              <w:t xml:space="preserve">EGP mn (parent share)</w:t>
+            </w:r>
+          </w:p>
+        </w:tc>
+        <w:tc>
+          <w:tcPr>
+            <w:tcW w:type="dxa" w:w="1650"/>
             <w:shd w:fill="F4F1EA" w:val="clear"/>
             <w:tcMar>
               <w:top w:type="dxa" w:w="60"/>
@@ -5183,13 +5185,13 @@
                 <w:sz w:val="19"/>
                 <w:szCs w:val="19"/>
               </w:rPr>
-              <w:t xml:space="preserve">Value</w:t>
-            </w:r>
-          </w:p>
-        </w:tc>
-        <w:tc>
-          <w:tcPr>
-            <w:tcW w:type="dxa" w:w="4500"/>
+              <w:t xml:space="preserve">Bear</w:t>
+            </w:r>
+          </w:p>
+        </w:tc>
+        <w:tc>
+          <w:tcPr>
+            <w:tcW w:type="dxa" w:w="1900"/>
             <w:shd w:fill="F4F1EA" w:val="clear"/>
             <w:tcMar>
               <w:top w:type="dxa" w:w="60"/>
@@ -5212,7 +5214,65 @@
                 <w:sz w:val="19"/>
                 <w:szCs w:val="19"/>
               </w:rPr>
-              <w:t xml:space="preserve">How</w:t>
+              <w:t xml:space="preserve">Base — stake at book (A)</w:t>
+            </w:r>
+          </w:p>
+        </w:tc>
+        <w:tc>
+          <w:tcPr>
+            <w:tcW w:type="dxa" w:w="2000"/>
+            <w:shd w:fill="F4F1EA" w:val="clear"/>
+            <w:tcMar>
+              <w:top w:type="dxa" w:w="60"/>
+              <w:left w:type="dxa" w:w="100"/>
+              <w:bottom w:type="dxa" w:w="60"/>
+              <w:right w:type="dxa" w:w="100"/>
+            </w:tcMar>
+          </w:tcPr>
+          <w:p>
+            <w:pPr>
+              <w:spacing w:after="0"/>
+              <w:jc w:val="right"/>
+            </w:pPr>
+            <w:r>
+              <w:rPr>
+                <w:rFonts w:ascii="Georgia" w:cs="Georgia" w:eastAsia="Georgia" w:hAnsi="Georgia"/>
+                <w:b/>
+                <w:bCs/>
+                <w:color w:val="12211E"/>
+                <w:sz w:val="19"/>
+                <w:szCs w:val="19"/>
+              </w:rPr>
+              <w:t xml:space="preserve">Base — stake at round price (B)</w:t>
+            </w:r>
+          </w:p>
+        </w:tc>
+        <w:tc>
+          <w:tcPr>
+            <w:tcW w:type="dxa" w:w="1650"/>
+            <w:shd w:fill="F4F1EA" w:val="clear"/>
+            <w:tcMar>
+              <w:top w:type="dxa" w:w="60"/>
+              <w:left w:type="dxa" w:w="100"/>
+              <w:bottom w:type="dxa" w:w="60"/>
+              <w:right w:type="dxa" w:w="100"/>
+            </w:tcMar>
+          </w:tcPr>
+          <w:p>
+            <w:pPr>
+              <w:spacing w:after="0"/>
+              <w:jc w:val="right"/>
+            </w:pPr>
+            <w:r>
+              <w:rPr>
+                <w:rFonts w:ascii="Georgia" w:cs="Georgia" w:eastAsia="Georgia" w:hAnsi="Georgia"/>
+                <w:b/>
+                <w:bCs/>
+                <w:color w:val="12211E"/>
+                <w:sz w:val="19"/>
+                <w:szCs w:val="19"/>
+              </w:rPr>
+              <w:t xml:space="preserve">Full</w:t>
             </w:r>
           </w:p>
         </w:tc>
@@ -5220,7 +5280,7 @@
       <w:tr>
         <w:tc>
           <w:tcPr>
-            <w:tcW w:type="dxa" w:w="4200"/>
+            <w:tcW w:type="dxa" w:w="3100"/>
             <w:tcMar>
               <w:top w:type="dxa" w:w="60"/>
               <w:left w:type="dxa" w:w="100"/>
@@ -5242,13 +5302,41 @@
                 <w:sz w:val="19"/>
                 <w:szCs w:val="19"/>
               </w:rPr>
-              <w:t xml:space="preserve">GB Auto (DCF at 24.2%, terminal growth 10%)</w:t>
-            </w:r>
-          </w:p>
-        </w:tc>
-        <w:tc>
-          <w:tcPr>
-            <w:tcW w:type="dxa" w:w="1700"/>
+              <w:t xml:space="preserve">Car business (GB Auto, DCF)</w:t>
+            </w:r>
+          </w:p>
+        </w:tc>
+        <w:tc>
+          <w:tcPr>
+            <w:tcW w:type="dxa" w:w="1650"/>
+            <w:tcMar>
+              <w:top w:type="dxa" w:w="60"/>
+              <w:left w:type="dxa" w:w="100"/>
+              <w:bottom w:type="dxa" w:w="60"/>
+              <w:right w:type="dxa" w:w="100"/>
+            </w:tcMar>
+          </w:tcPr>
+          <w:p>
+            <w:pPr>
+              <w:spacing w:after="0"/>
+              <w:jc w:val="right"/>
+            </w:pPr>
+            <w:r>
+              <w:rPr>
+                <w:rFonts w:ascii="Georgia" w:cs="Georgia" w:eastAsia="Georgia" w:hAnsi="Georgia"/>
+                <w:b w:val="false"/>
+                <w:bCs w:val="false"/>
+                <w:color w:val="12211E"/>
+                <w:sz w:val="19"/>
+                <w:szCs w:val="19"/>
+              </w:rPr>
+              <w:t xml:space="preserve">3,712</w:t>
+            </w:r>
+          </w:p>
+        </w:tc>
+        <w:tc>
+          <w:tcPr>
+            <w:tcW w:type="dxa" w:w="1900"/>
             <w:tcMar>
               <w:top w:type="dxa" w:w="60"/>
               <w:left w:type="dxa" w:w="100"/>
@@ -5276,29 +5364,57 @@
         </w:tc>
         <w:tc>
           <w:tcPr>
-            <w:tcW w:type="dxa" w:w="4500"/>
-            <w:tcMar>
-              <w:top w:type="dxa" w:w="60"/>
-              <w:left w:type="dxa" w:w="100"/>
-              <w:bottom w:type="dxa" w:w="60"/>
-              <w:right w:type="dxa" w:w="100"/>
-            </w:tcMar>
-          </w:tcPr>
-          <w:p>
-            <w:pPr>
-              <w:spacing w:after="0"/>
-              <w:jc w:val="right"/>
-            </w:pPr>
-            <w:r>
-              <w:rPr>
-                <w:rFonts w:ascii="Georgia" w:cs="Georgia" w:eastAsia="Georgia" w:hAnsi="Georgia"/>
-                <w:b w:val="false"/>
-                <w:bCs w:val="false"/>
-                <w:color w:val="12211E"/>
-                <w:sz w:val="19"/>
-                <w:szCs w:val="19"/>
-              </w:rPr>
-              <w:t xml:space="preserve">enterprise 22,198 less net debt 15,210 and minorities</w:t>
+            <w:tcW w:type="dxa" w:w="2000"/>
+            <w:tcMar>
+              <w:top w:type="dxa" w:w="60"/>
+              <w:left w:type="dxa" w:w="100"/>
+              <w:bottom w:type="dxa" w:w="60"/>
+              <w:right w:type="dxa" w:w="100"/>
+            </w:tcMar>
+          </w:tcPr>
+          <w:p>
+            <w:pPr>
+              <w:spacing w:after="0"/>
+              <w:jc w:val="right"/>
+            </w:pPr>
+            <w:r>
+              <w:rPr>
+                <w:rFonts w:ascii="Georgia" w:cs="Georgia" w:eastAsia="Georgia" w:hAnsi="Georgia"/>
+                <w:b w:val="false"/>
+                <w:bCs w:val="false"/>
+                <w:color w:val="12211E"/>
+                <w:sz w:val="19"/>
+                <w:szCs w:val="19"/>
+              </w:rPr>
+              <w:t xml:space="preserve">6,187</w:t>
+            </w:r>
+          </w:p>
+        </w:tc>
+        <w:tc>
+          <w:tcPr>
+            <w:tcW w:type="dxa" w:w="1650"/>
+            <w:tcMar>
+              <w:top w:type="dxa" w:w="60"/>
+              <w:left w:type="dxa" w:w="100"/>
+              <w:bottom w:type="dxa" w:w="60"/>
+              <w:right w:type="dxa" w:w="100"/>
+            </w:tcMar>
+          </w:tcPr>
+          <w:p>
+            <w:pPr>
+              <w:spacing w:after="0"/>
+              <w:jc w:val="right"/>
+            </w:pPr>
+            <w:r>
+              <w:rPr>
+                <w:rFonts w:ascii="Georgia" w:cs="Georgia" w:eastAsia="Georgia" w:hAnsi="Georgia"/>
+                <w:b w:val="false"/>
+                <w:bCs w:val="false"/>
+                <w:color w:val="12211E"/>
+                <w:sz w:val="19"/>
+                <w:szCs w:val="19"/>
+              </w:rPr>
+              <w:t xml:space="preserve">8,662</w:t>
             </w:r>
           </w:p>
         </w:tc>
@@ -5306,7 +5422,7 @@
       <w:tr>
         <w:tc>
           <w:tcPr>
-            <w:tcW w:type="dxa" w:w="4200"/>
+            <w:tcW w:type="dxa" w:w="3100"/>
             <w:tcMar>
               <w:top w:type="dxa" w:w="60"/>
               <w:left w:type="dxa" w:w="100"/>
@@ -5328,13 +5444,41 @@
                 <w:sz w:val="19"/>
                 <w:szCs w:val="19"/>
               </w:rPr>
-              <w:t xml:space="preserve">GB Capital ex-MNT</w:t>
-            </w:r>
-          </w:p>
-        </w:tc>
-        <w:tc>
-          <w:tcPr>
-            <w:tcW w:type="dxa" w:w="1700"/>
+              <w:t xml:space="preserve">Lender (GB Capital ex-MNT)</w:t>
+            </w:r>
+          </w:p>
+        </w:tc>
+        <w:tc>
+          <w:tcPr>
+            <w:tcW w:type="dxa" w:w="1650"/>
+            <w:tcMar>
+              <w:top w:type="dxa" w:w="60"/>
+              <w:left w:type="dxa" w:w="100"/>
+              <w:bottom w:type="dxa" w:w="60"/>
+              <w:right w:type="dxa" w:w="100"/>
+            </w:tcMar>
+          </w:tcPr>
+          <w:p>
+            <w:pPr>
+              <w:spacing w:after="0"/>
+              <w:jc w:val="right"/>
+            </w:pPr>
+            <w:r>
+              <w:rPr>
+                <w:rFonts w:ascii="Georgia" w:cs="Georgia" w:eastAsia="Georgia" w:hAnsi="Georgia"/>
+                <w:b w:val="false"/>
+                <w:bCs w:val="false"/>
+                <w:color w:val="12211E"/>
+                <w:sz w:val="19"/>
+                <w:szCs w:val="19"/>
+              </w:rPr>
+              <w:t xml:space="preserve">4,367</w:t>
+            </w:r>
+          </w:p>
+        </w:tc>
+        <w:tc>
+          <w:tcPr>
+            <w:tcW w:type="dxa" w:w="1900"/>
             <w:tcMar>
               <w:top w:type="dxa" w:w="60"/>
               <w:left w:type="dxa" w:w="100"/>
@@ -5362,29 +5506,57 @@
         </w:tc>
         <w:tc>
           <w:tcPr>
-            <w:tcW w:type="dxa" w:w="4500"/>
-            <w:tcMar>
-              <w:top w:type="dxa" w:w="60"/>
-              <w:left w:type="dxa" w:w="100"/>
-              <w:bottom w:type="dxa" w:w="60"/>
-              <w:right w:type="dxa" w:w="100"/>
-            </w:tcMar>
-          </w:tcPr>
-          <w:p>
-            <w:pPr>
-              <w:spacing w:after="0"/>
-              <w:jc w:val="right"/>
-            </w:pPr>
-            <w:r>
-              <w:rPr>
-                <w:rFonts w:ascii="Georgia" w:cs="Georgia" w:eastAsia="Georgia" w:hAnsi="Georgia"/>
-                <w:b w:val="false"/>
-                <w:bCs w:val="false"/>
-                <w:color w:val="12211E"/>
-                <w:sz w:val="19"/>
-                <w:szCs w:val="19"/>
-              </w:rPr>
-              <w:t xml:space="preserve">1.0× book (band 0.8–1.4× in bear/full)</w:t>
+            <w:tcW w:type="dxa" w:w="2000"/>
+            <w:tcMar>
+              <w:top w:type="dxa" w:w="60"/>
+              <w:left w:type="dxa" w:w="100"/>
+              <w:bottom w:type="dxa" w:w="60"/>
+              <w:right w:type="dxa" w:w="100"/>
+            </w:tcMar>
+          </w:tcPr>
+          <w:p>
+            <w:pPr>
+              <w:spacing w:after="0"/>
+              <w:jc w:val="right"/>
+            </w:pPr>
+            <w:r>
+              <w:rPr>
+                <w:rFonts w:ascii="Georgia" w:cs="Georgia" w:eastAsia="Georgia" w:hAnsi="Georgia"/>
+                <w:b w:val="false"/>
+                <w:bCs w:val="false"/>
+                <w:color w:val="12211E"/>
+                <w:sz w:val="19"/>
+                <w:szCs w:val="19"/>
+              </w:rPr>
+              <w:t xml:space="preserve">5,459</w:t>
+            </w:r>
+          </w:p>
+        </w:tc>
+        <w:tc>
+          <w:tcPr>
+            <w:tcW w:type="dxa" w:w="1650"/>
+            <w:tcMar>
+              <w:top w:type="dxa" w:w="60"/>
+              <w:left w:type="dxa" w:w="100"/>
+              <w:bottom w:type="dxa" w:w="60"/>
+              <w:right w:type="dxa" w:w="100"/>
+            </w:tcMar>
+          </w:tcPr>
+          <w:p>
+            <w:pPr>
+              <w:spacing w:after="0"/>
+              <w:jc w:val="right"/>
+            </w:pPr>
+            <w:r>
+              <w:rPr>
+                <w:rFonts w:ascii="Georgia" w:cs="Georgia" w:eastAsia="Georgia" w:hAnsi="Georgia"/>
+                <w:b w:val="false"/>
+                <w:bCs w:val="false"/>
+                <w:color w:val="12211E"/>
+                <w:sz w:val="19"/>
+                <w:szCs w:val="19"/>
+              </w:rPr>
+              <w:t xml:space="preserve">7,643</w:t>
             </w:r>
           </w:p>
         </w:tc>
@@ -5392,7 +5564,7 @@
       <w:tr>
         <w:tc>
           <w:tcPr>
-            <w:tcW w:type="dxa" w:w="4200"/>
+            <w:tcW w:type="dxa" w:w="3100"/>
             <w:tcMar>
               <w:top w:type="dxa" w:w="60"/>
               <w:left w:type="dxa" w:w="100"/>
@@ -5414,13 +5586,13 @@
                 <w:sz w:val="19"/>
                 <w:szCs w:val="19"/>
               </w:rPr>
-              <w:t xml:space="preserve">MNT-Halan stake — framing A</w:t>
-            </w:r>
-          </w:p>
-        </w:tc>
-        <w:tc>
-          <w:tcPr>
-            <w:tcW w:type="dxa" w:w="1700"/>
+              <w:t xml:space="preserve">MNT-Halan stake</w:t>
+            </w:r>
+          </w:p>
+        </w:tc>
+        <w:tc>
+          <w:tcPr>
+            <w:tcW w:type="dxa" w:w="1650"/>
             <w:tcMar>
               <w:top w:type="dxa" w:w="60"/>
               <w:left w:type="dxa" w:w="100"/>
@@ -5448,29 +5620,85 @@
         </w:tc>
         <w:tc>
           <w:tcPr>
-            <w:tcW w:type="dxa" w:w="4500"/>
-            <w:tcMar>
-              <w:top w:type="dxa" w:w="60"/>
-              <w:left w:type="dxa" w:w="100"/>
-              <w:bottom w:type="dxa" w:w="60"/>
-              <w:right w:type="dxa" w:w="100"/>
-            </w:tcMar>
-          </w:tcPr>
-          <w:p>
-            <w:pPr>
-              <w:spacing w:after="0"/>
-              <w:jc w:val="right"/>
-            </w:pPr>
-            <w:r>
-              <w:rPr>
-                <w:rFonts w:ascii="Georgia" w:cs="Georgia" w:eastAsia="Georgia" w:hAnsi="Georgia"/>
-                <w:b w:val="false"/>
-                <w:bCs w:val="false"/>
-                <w:color w:val="12211E"/>
-                <w:sz w:val="19"/>
-                <w:szCs w:val="19"/>
-              </w:rPr>
-              <w:t xml:space="preserve">audited carrying value (equity method)</w:t>
+            <w:tcW w:type="dxa" w:w="1900"/>
+            <w:tcMar>
+              <w:top w:type="dxa" w:w="60"/>
+              <w:left w:type="dxa" w:w="100"/>
+              <w:bottom w:type="dxa" w:w="60"/>
+              <w:right w:type="dxa" w:w="100"/>
+            </w:tcMar>
+          </w:tcPr>
+          <w:p>
+            <w:pPr>
+              <w:spacing w:after="0"/>
+              <w:jc w:val="right"/>
+            </w:pPr>
+            <w:r>
+              <w:rPr>
+                <w:rFonts w:ascii="Georgia" w:cs="Georgia" w:eastAsia="Georgia" w:hAnsi="Georgia"/>
+                <w:b w:val="false"/>
+                <w:bCs w:val="false"/>
+                <w:color w:val="12211E"/>
+                <w:sz w:val="19"/>
+                <w:szCs w:val="19"/>
+              </w:rPr>
+              <w:t xml:space="preserve">12,853</w:t>
+            </w:r>
+          </w:p>
+        </w:tc>
+        <w:tc>
+          <w:tcPr>
+            <w:tcW w:type="dxa" w:w="2000"/>
+            <w:tcMar>
+              <w:top w:type="dxa" w:w="60"/>
+              <w:left w:type="dxa" w:w="100"/>
+              <w:bottom w:type="dxa" w:w="60"/>
+              <w:right w:type="dxa" w:w="100"/>
+            </w:tcMar>
+          </w:tcPr>
+          <w:p>
+            <w:pPr>
+              <w:spacing w:after="0"/>
+              <w:jc w:val="right"/>
+            </w:pPr>
+            <w:r>
+              <w:rPr>
+                <w:rFonts w:ascii="Georgia" w:cs="Georgia" w:eastAsia="Georgia" w:hAnsi="Georgia"/>
+                <w:b w:val="false"/>
+                <w:bCs w:val="false"/>
+                <w:color w:val="12211E"/>
+                <w:sz w:val="19"/>
+                <w:szCs w:val="19"/>
+              </w:rPr>
+              <w:t xml:space="preserve">30,201</w:t>
+            </w:r>
+          </w:p>
+        </w:tc>
+        <w:tc>
+          <w:tcPr>
+            <w:tcW w:type="dxa" w:w="1650"/>
+            <w:tcMar>
+              <w:top w:type="dxa" w:w="60"/>
+              <w:left w:type="dxa" w:w="100"/>
+              <w:bottom w:type="dxa" w:w="60"/>
+              <w:right w:type="dxa" w:w="100"/>
+            </w:tcMar>
+          </w:tcPr>
+          <w:p>
+            <w:pPr>
+              <w:spacing w:after="0"/>
+              <w:jc w:val="right"/>
+            </w:pPr>
+            <w:r>
+              <w:rPr>
+                <w:rFonts w:ascii="Georgia" w:cs="Georgia" w:eastAsia="Georgia" w:hAnsi="Georgia"/>
+                <w:b w:val="false"/>
+                <w:bCs w:val="false"/>
+                <w:color w:val="12211E"/>
+                <w:sz w:val="19"/>
+                <w:szCs w:val="19"/>
+              </w:rPr>
+              <w:t xml:space="preserve">36,591</w:t>
             </w:r>
           </w:p>
         </w:tc>
@@ -5478,7 +5706,7 @@
       <w:tr>
         <w:tc>
           <w:tcPr>
-            <w:tcW w:type="dxa" w:w="4200"/>
+            <w:tcW w:type="dxa" w:w="3100"/>
             <w:tcMar>
               <w:top w:type="dxa" w:w="60"/>
               <w:left w:type="dxa" w:w="100"/>
@@ -5500,63 +5728,119 @@
                 <w:sz w:val="19"/>
                 <w:szCs w:val="19"/>
               </w:rPr>
-              <w:t xml:space="preserve">MNT-Halan stake — framing B</w:t>
-            </w:r>
-          </w:p>
-        </w:tc>
-        <w:tc>
-          <w:tcPr>
-            <w:tcW w:type="dxa" w:w="1700"/>
-            <w:tcMar>
-              <w:top w:type="dxa" w:w="60"/>
-              <w:left w:type="dxa" w:w="100"/>
-              <w:bottom w:type="dxa" w:w="60"/>
-              <w:right w:type="dxa" w:w="100"/>
-            </w:tcMar>
-          </w:tcPr>
-          <w:p>
-            <w:pPr>
-              <w:spacing w:after="0"/>
-              <w:jc w:val="right"/>
-            </w:pPr>
-            <w:r>
-              <w:rPr>
-                <w:rFonts w:ascii="Georgia" w:cs="Georgia" w:eastAsia="Georgia" w:hAnsi="Georgia"/>
-                <w:b w:val="false"/>
-                <w:bCs w:val="false"/>
-                <w:color w:val="12211E"/>
-                <w:sz w:val="19"/>
-                <w:szCs w:val="19"/>
-              </w:rPr>
-              <w:t xml:space="preserve">30,201</w:t>
-            </w:r>
-          </w:p>
-        </w:tc>
-        <w:tc>
-          <w:tcPr>
-            <w:tcW w:type="dxa" w:w="4500"/>
-            <w:tcMar>
-              <w:top w:type="dxa" w:w="60"/>
-              <w:left w:type="dxa" w:w="100"/>
-              <w:bottom w:type="dxa" w:w="60"/>
-              <w:right w:type="dxa" w:w="100"/>
-            </w:tcMar>
-          </w:tcPr>
-          <w:p>
-            <w:pPr>
-              <w:spacing w:after="0"/>
-              <w:jc w:val="right"/>
-            </w:pPr>
-            <w:r>
-              <w:rPr>
-                <w:rFonts w:ascii="Georgia" w:cs="Georgia" w:eastAsia="Georgia" w:hAnsi="Georgia"/>
-                <w:b w:val="false"/>
-                <w:bCs w:val="false"/>
-                <w:color w:val="12211E"/>
-                <w:sz w:val="19"/>
-                <w:szCs w:val="19"/>
-              </w:rPr>
-              <w:t xml:space="preserve">USD 1.4bn June-2026 round × 42.93% × 50.25</w:t>
+              <w:t xml:space="preserve">Other investments</w:t>
+            </w:r>
+          </w:p>
+        </w:tc>
+        <w:tc>
+          <w:tcPr>
+            <w:tcW w:type="dxa" w:w="1650"/>
+            <w:tcMar>
+              <w:top w:type="dxa" w:w="60"/>
+              <w:left w:type="dxa" w:w="100"/>
+              <w:bottom w:type="dxa" w:w="60"/>
+              <w:right w:type="dxa" w:w="100"/>
+            </w:tcMar>
+          </w:tcPr>
+          <w:p>
+            <w:pPr>
+              <w:spacing w:after="0"/>
+              <w:jc w:val="right"/>
+            </w:pPr>
+            <w:r>
+              <w:rPr>
+                <w:rFonts w:ascii="Georgia" w:cs="Georgia" w:eastAsia="Georgia" w:hAnsi="Georgia"/>
+                <w:b w:val="false"/>
+                <w:bCs w:val="false"/>
+                <w:color w:val="12211E"/>
+                <w:sz w:val="19"/>
+                <w:szCs w:val="19"/>
+              </w:rPr>
+              <w:t xml:space="preserve">836</w:t>
+            </w:r>
+          </w:p>
+        </w:tc>
+        <w:tc>
+          <w:tcPr>
+            <w:tcW w:type="dxa" w:w="1900"/>
+            <w:tcMar>
+              <w:top w:type="dxa" w:w="60"/>
+              <w:left w:type="dxa" w:w="100"/>
+              <w:bottom w:type="dxa" w:w="60"/>
+              <w:right w:type="dxa" w:w="100"/>
+            </w:tcMar>
+          </w:tcPr>
+          <w:p>
+            <w:pPr>
+              <w:spacing w:after="0"/>
+              <w:jc w:val="right"/>
+            </w:pPr>
+            <w:r>
+              <w:rPr>
+                <w:rFonts w:ascii="Georgia" w:cs="Georgia" w:eastAsia="Georgia" w:hAnsi="Georgia"/>
+                <w:b w:val="false"/>
+                <w:bCs w:val="false"/>
+                <w:color w:val="12211E"/>
+                <w:sz w:val="19"/>
+                <w:szCs w:val="19"/>
+              </w:rPr>
+              <w:t xml:space="preserve">836</w:t>
+            </w:r>
+          </w:p>
+        </w:tc>
+        <w:tc>
+          <w:tcPr>
+            <w:tcW w:type="dxa" w:w="2000"/>
+            <w:tcMar>
+              <w:top w:type="dxa" w:w="60"/>
+              <w:left w:type="dxa" w:w="100"/>
+              <w:bottom w:type="dxa" w:w="60"/>
+              <w:right w:type="dxa" w:w="100"/>
+            </w:tcMar>
+          </w:tcPr>
+          <w:p>
+            <w:pPr>
+              <w:spacing w:after="0"/>
+              <w:jc w:val="right"/>
+            </w:pPr>
+            <w:r>
+              <w:rPr>
+                <w:rFonts w:ascii="Georgia" w:cs="Georgia" w:eastAsia="Georgia" w:hAnsi="Georgia"/>
+                <w:b w:val="false"/>
+                <w:bCs w:val="false"/>
+                <w:color w:val="12211E"/>
+                <w:sz w:val="19"/>
+                <w:szCs w:val="19"/>
+              </w:rPr>
+              <w:t xml:space="preserve">836</w:t>
+            </w:r>
+          </w:p>
+        </w:tc>
+        <w:tc>
+          <w:tcPr>
+            <w:tcW w:type="dxa" w:w="1650"/>
+            <w:tcMar>
+              <w:top w:type="dxa" w:w="60"/>
+              <w:left w:type="dxa" w:w="100"/>
+              <w:bottom w:type="dxa" w:w="60"/>
+              <w:right w:type="dxa" w:w="100"/>
+            </w:tcMar>
+          </w:tcPr>
+          <w:p>
+            <w:pPr>
+              <w:spacing w:after="0"/>
+              <w:jc w:val="right"/>
+            </w:pPr>
+            <w:r>
+              <w:rPr>
+                <w:rFonts w:ascii="Georgia" w:cs="Georgia" w:eastAsia="Georgia" w:hAnsi="Georgia"/>
+                <w:b w:val="false"/>
+                <w:bCs w:val="false"/>
+                <w:color w:val="12211E"/>
+                <w:sz w:val="19"/>
+                <w:szCs w:val="19"/>
+              </w:rPr>
+              <w:t xml:space="preserve">836</w:t>
             </w:r>
           </w:p>
         </w:tc>
@@ -5564,7 +5848,7 @@
       <w:tr>
         <w:tc>
           <w:tcPr>
-            <w:tcW w:type="dxa" w:w="4200"/>
+            <w:tcW w:type="dxa" w:w="3100"/>
             <w:tcMar>
               <w:top w:type="dxa" w:w="60"/>
               <w:left w:type="dxa" w:w="100"/>
@@ -5586,63 +5870,119 @@
                 <w:sz w:val="19"/>
                 <w:szCs w:val="19"/>
               </w:rPr>
-              <w:t xml:space="preserve">Other associates &amp; investments</w:t>
-            </w:r>
-          </w:p>
-        </w:tc>
-        <w:tc>
-          <w:tcPr>
-            <w:tcW w:type="dxa" w:w="1700"/>
-            <w:tcMar>
-              <w:top w:type="dxa" w:w="60"/>
-              <w:left w:type="dxa" w:w="100"/>
-              <w:bottom w:type="dxa" w:w="60"/>
-              <w:right w:type="dxa" w:w="100"/>
-            </w:tcMar>
-          </w:tcPr>
-          <w:p>
-            <w:pPr>
-              <w:spacing w:after="0"/>
-              <w:jc w:val="right"/>
-            </w:pPr>
-            <w:r>
-              <w:rPr>
-                <w:rFonts w:ascii="Georgia" w:cs="Georgia" w:eastAsia="Georgia" w:hAnsi="Georgia"/>
-                <w:b w:val="false"/>
-                <w:bCs w:val="false"/>
-                <w:color w:val="12211E"/>
-                <w:sz w:val="19"/>
-                <w:szCs w:val="19"/>
-              </w:rPr>
-              <w:t xml:space="preserve">836</w:t>
-            </w:r>
-          </w:p>
-        </w:tc>
-        <w:tc>
-          <w:tcPr>
-            <w:tcW w:type="dxa" w:w="4500"/>
-            <w:tcMar>
-              <w:top w:type="dxa" w:w="60"/>
-              <w:left w:type="dxa" w:w="100"/>
-              <w:bottom w:type="dxa" w:w="60"/>
-              <w:right w:type="dxa" w:w="100"/>
-            </w:tcMar>
-          </w:tcPr>
-          <w:p>
-            <w:pPr>
-              <w:spacing w:after="0"/>
-              <w:jc w:val="right"/>
-            </w:pPr>
-            <w:r>
-              <w:rPr>
-                <w:rFonts w:ascii="Georgia" w:cs="Georgia" w:eastAsia="Georgia" w:hAnsi="Georgia"/>
-                <w:b w:val="false"/>
-                <w:bCs w:val="false"/>
-                <w:color w:val="12211E"/>
-                <w:sz w:val="19"/>
-                <w:szCs w:val="19"/>
-              </w:rPr>
-              <w:t xml:space="preserve">carrying value</w:t>
+              <w:t xml:space="preserve">Sum of the pieces</w:t>
+            </w:r>
+          </w:p>
+        </w:tc>
+        <w:tc>
+          <w:tcPr>
+            <w:tcW w:type="dxa" w:w="1650"/>
+            <w:tcMar>
+              <w:top w:type="dxa" w:w="60"/>
+              <w:left w:type="dxa" w:w="100"/>
+              <w:bottom w:type="dxa" w:w="60"/>
+              <w:right w:type="dxa" w:w="100"/>
+            </w:tcMar>
+          </w:tcPr>
+          <w:p>
+            <w:pPr>
+              <w:spacing w:after="0"/>
+              <w:jc w:val="right"/>
+            </w:pPr>
+            <w:r>
+              <w:rPr>
+                <w:rFonts w:ascii="Georgia" w:cs="Georgia" w:eastAsia="Georgia" w:hAnsi="Georgia"/>
+                <w:b w:val="false"/>
+                <w:bCs w:val="false"/>
+                <w:color w:val="12211E"/>
+                <w:sz w:val="19"/>
+                <w:szCs w:val="19"/>
+              </w:rPr>
+              <w:t xml:space="preserve">21,769</w:t>
+            </w:r>
+          </w:p>
+        </w:tc>
+        <w:tc>
+          <w:tcPr>
+            <w:tcW w:type="dxa" w:w="1900"/>
+            <w:tcMar>
+              <w:top w:type="dxa" w:w="60"/>
+              <w:left w:type="dxa" w:w="100"/>
+              <w:bottom w:type="dxa" w:w="60"/>
+              <w:right w:type="dxa" w:w="100"/>
+            </w:tcMar>
+          </w:tcPr>
+          <w:p>
+            <w:pPr>
+              <w:spacing w:after="0"/>
+              <w:jc w:val="right"/>
+            </w:pPr>
+            <w:r>
+              <w:rPr>
+                <w:rFonts w:ascii="Georgia" w:cs="Georgia" w:eastAsia="Georgia" w:hAnsi="Georgia"/>
+                <w:b w:val="false"/>
+                <w:bCs w:val="false"/>
+                <w:color w:val="12211E"/>
+                <w:sz w:val="19"/>
+                <w:szCs w:val="19"/>
+              </w:rPr>
+              <w:t xml:space="preserve">25,336</w:t>
+            </w:r>
+          </w:p>
+        </w:tc>
+        <w:tc>
+          <w:tcPr>
+            <w:tcW w:type="dxa" w:w="2000"/>
+            <w:tcMar>
+              <w:top w:type="dxa" w:w="60"/>
+              <w:left w:type="dxa" w:w="100"/>
+              <w:bottom w:type="dxa" w:w="60"/>
+              <w:right w:type="dxa" w:w="100"/>
+            </w:tcMar>
+          </w:tcPr>
+          <w:p>
+            <w:pPr>
+              <w:spacing w:after="0"/>
+              <w:jc w:val="right"/>
+            </w:pPr>
+            <w:r>
+              <w:rPr>
+                <w:rFonts w:ascii="Georgia" w:cs="Georgia" w:eastAsia="Georgia" w:hAnsi="Georgia"/>
+                <w:b w:val="false"/>
+                <w:bCs w:val="false"/>
+                <w:color w:val="12211E"/>
+                <w:sz w:val="19"/>
+                <w:szCs w:val="19"/>
+              </w:rPr>
+              <w:t xml:space="preserve">42,684</w:t>
+            </w:r>
+          </w:p>
+        </w:tc>
+        <w:tc>
+          <w:tcPr>
+            <w:tcW w:type="dxa" w:w="1650"/>
+            <w:tcMar>
+              <w:top w:type="dxa" w:w="60"/>
+              <w:left w:type="dxa" w:w="100"/>
+              <w:bottom w:type="dxa" w:w="60"/>
+              <w:right w:type="dxa" w:w="100"/>
+            </w:tcMar>
+          </w:tcPr>
+          <w:p>
+            <w:pPr>
+              <w:spacing w:after="0"/>
+              <w:jc w:val="right"/>
+            </w:pPr>
+            <w:r>
+              <w:rPr>
+                <w:rFonts w:ascii="Georgia" w:cs="Georgia" w:eastAsia="Georgia" w:hAnsi="Georgia"/>
+                <w:b w:val="false"/>
+                <w:bCs w:val="false"/>
+                <w:color w:val="12211E"/>
+                <w:sz w:val="19"/>
+                <w:szCs w:val="19"/>
+              </w:rPr>
+              <w:t xml:space="preserve">53,732</w:t>
             </w:r>
           </w:p>
         </w:tc>
@@ -5650,7 +5990,7 @@
       <w:tr>
         <w:tc>
           <w:tcPr>
-            <w:tcW w:type="dxa" w:w="4200"/>
+            <w:tcW w:type="dxa" w:w="3100"/>
             <w:tcMar>
               <w:top w:type="dxa" w:w="60"/>
               <w:left w:type="dxa" w:w="100"/>
@@ -5672,63 +6012,119 @@
                 <w:sz w:val="19"/>
                 <w:szCs w:val="19"/>
               </w:rPr>
-              <w:t xml:space="preserve">Total (A) after 10% holding discount</w:t>
-            </w:r>
-          </w:p>
-        </w:tc>
-        <w:tc>
-          <w:tcPr>
-            <w:tcW w:type="dxa" w:w="1700"/>
-            <w:tcMar>
-              <w:top w:type="dxa" w:w="60"/>
-              <w:left w:type="dxa" w:w="100"/>
-              <w:bottom w:type="dxa" w:w="60"/>
-              <w:right w:type="dxa" w:w="100"/>
-            </w:tcMar>
-          </w:tcPr>
-          <w:p>
-            <w:pPr>
-              <w:spacing w:after="0"/>
-              <w:jc w:val="right"/>
-            </w:pPr>
-            <w:r>
-              <w:rPr>
-                <w:rFonts w:ascii="Georgia" w:cs="Georgia" w:eastAsia="Georgia" w:hAnsi="Georgia"/>
-                <w:b w:val="false"/>
-                <w:bCs w:val="false"/>
-                <w:color w:val="12211E"/>
-                <w:sz w:val="19"/>
-                <w:szCs w:val="19"/>
-              </w:rPr>
-              <w:t xml:space="preserve">22,803</w:t>
-            </w:r>
-          </w:p>
-        </w:tc>
-        <w:tc>
-          <w:tcPr>
-            <w:tcW w:type="dxa" w:w="4500"/>
-            <w:tcMar>
-              <w:top w:type="dxa" w:w="60"/>
-              <w:left w:type="dxa" w:w="100"/>
-              <w:bottom w:type="dxa" w:w="60"/>
-              <w:right w:type="dxa" w:w="100"/>
-            </w:tcMar>
-          </w:tcPr>
-          <w:p>
-            <w:pPr>
-              <w:spacing w:after="0"/>
-              <w:jc w:val="right"/>
-            </w:pPr>
-            <w:r>
-              <w:rPr>
-                <w:rFonts w:ascii="Georgia" w:cs="Georgia" w:eastAsia="Georgia" w:hAnsi="Georgia"/>
-                <w:b w:val="false"/>
-                <w:bCs w:val="false"/>
-                <w:color w:val="12211E"/>
-                <w:sz w:val="19"/>
-                <w:szCs w:val="19"/>
-              </w:rPr>
-              <w:t xml:space="preserve">21.0 per share</w:t>
+              <w:t xml:space="preserve">= per share, BEFORE discount</w:t>
+            </w:r>
+          </w:p>
+        </w:tc>
+        <w:tc>
+          <w:tcPr>
+            <w:tcW w:type="dxa" w:w="1650"/>
+            <w:tcMar>
+              <w:top w:type="dxa" w:w="60"/>
+              <w:left w:type="dxa" w:w="100"/>
+              <w:bottom w:type="dxa" w:w="60"/>
+              <w:right w:type="dxa" w:w="100"/>
+            </w:tcMar>
+          </w:tcPr>
+          <w:p>
+            <w:pPr>
+              <w:spacing w:after="0"/>
+              <w:jc w:val="right"/>
+            </w:pPr>
+            <w:r>
+              <w:rPr>
+                <w:rFonts w:ascii="Georgia" w:cs="Georgia" w:eastAsia="Georgia" w:hAnsi="Georgia"/>
+                <w:b w:val="false"/>
+                <w:bCs w:val="false"/>
+                <w:color w:val="12211E"/>
+                <w:sz w:val="19"/>
+                <w:szCs w:val="19"/>
+              </w:rPr>
+              <w:t xml:space="preserve">20.1</w:t>
+            </w:r>
+          </w:p>
+        </w:tc>
+        <w:tc>
+          <w:tcPr>
+            <w:tcW w:type="dxa" w:w="1900"/>
+            <w:tcMar>
+              <w:top w:type="dxa" w:w="60"/>
+              <w:left w:type="dxa" w:w="100"/>
+              <w:bottom w:type="dxa" w:w="60"/>
+              <w:right w:type="dxa" w:w="100"/>
+            </w:tcMar>
+          </w:tcPr>
+          <w:p>
+            <w:pPr>
+              <w:spacing w:after="0"/>
+              <w:jc w:val="right"/>
+            </w:pPr>
+            <w:r>
+              <w:rPr>
+                <w:rFonts w:ascii="Georgia" w:cs="Georgia" w:eastAsia="Georgia" w:hAnsi="Georgia"/>
+                <w:b w:val="false"/>
+                <w:bCs w:val="false"/>
+                <w:color w:val="12211E"/>
+                <w:sz w:val="19"/>
+                <w:szCs w:val="19"/>
+              </w:rPr>
+              <w:t xml:space="preserve">23.3</w:t>
+            </w:r>
+          </w:p>
+        </w:tc>
+        <w:tc>
+          <w:tcPr>
+            <w:tcW w:type="dxa" w:w="2000"/>
+            <w:tcMar>
+              <w:top w:type="dxa" w:w="60"/>
+              <w:left w:type="dxa" w:w="100"/>
+              <w:bottom w:type="dxa" w:w="60"/>
+              <w:right w:type="dxa" w:w="100"/>
+            </w:tcMar>
+          </w:tcPr>
+          <w:p>
+            <w:pPr>
+              <w:spacing w:after="0"/>
+              <w:jc w:val="right"/>
+            </w:pPr>
+            <w:r>
+              <w:rPr>
+                <w:rFonts w:ascii="Georgia" w:cs="Georgia" w:eastAsia="Georgia" w:hAnsi="Georgia"/>
+                <w:b w:val="false"/>
+                <w:bCs w:val="false"/>
+                <w:color w:val="12211E"/>
+                <w:sz w:val="19"/>
+                <w:szCs w:val="19"/>
+              </w:rPr>
+              <w:t xml:space="preserve">39.3</w:t>
+            </w:r>
+          </w:p>
+        </w:tc>
+        <w:tc>
+          <w:tcPr>
+            <w:tcW w:type="dxa" w:w="1650"/>
+            <w:tcMar>
+              <w:top w:type="dxa" w:w="60"/>
+              <w:left w:type="dxa" w:w="100"/>
+              <w:bottom w:type="dxa" w:w="60"/>
+              <w:right w:type="dxa" w:w="100"/>
+            </w:tcMar>
+          </w:tcPr>
+          <w:p>
+            <w:pPr>
+              <w:spacing w:after="0"/>
+              <w:jc w:val="right"/>
+            </w:pPr>
+            <w:r>
+              <w:rPr>
+                <w:rFonts w:ascii="Georgia" w:cs="Georgia" w:eastAsia="Georgia" w:hAnsi="Georgia"/>
+                <w:b w:val="false"/>
+                <w:bCs w:val="false"/>
+                <w:color w:val="12211E"/>
+                <w:sz w:val="19"/>
+                <w:szCs w:val="19"/>
+              </w:rPr>
+              <w:t xml:space="preserve">49.5</w:t>
             </w:r>
           </w:p>
         </w:tc>
@@ -5736,7 +6132,7 @@
       <w:tr>
         <w:tc>
           <w:tcPr>
-            <w:tcW w:type="dxa" w:w="4200"/>
+            <w:tcW w:type="dxa" w:w="3100"/>
             <w:tcMar>
               <w:top w:type="dxa" w:w="60"/>
               <w:left w:type="dxa" w:w="100"/>
@@ -5758,13 +6154,211 @@
                 <w:sz w:val="19"/>
                 <w:szCs w:val="19"/>
               </w:rPr>
-              <w:t xml:space="preserve">Total (B) after 10% holding discount</w:t>
-            </w:r>
-          </w:p>
-        </w:tc>
-        <w:tc>
-          <w:tcPr>
-            <w:tcW w:type="dxa" w:w="1700"/>
+              <w:t xml:space="preserve">10% holding discount</w:t>
+            </w:r>
+          </w:p>
+        </w:tc>
+        <w:tc>
+          <w:tcPr>
+            <w:tcW w:type="dxa" w:w="1650"/>
+            <w:tcMar>
+              <w:top w:type="dxa" w:w="60"/>
+              <w:left w:type="dxa" w:w="100"/>
+              <w:bottom w:type="dxa" w:w="60"/>
+              <w:right w:type="dxa" w:w="100"/>
+            </w:tcMar>
+          </w:tcPr>
+          <w:p>
+            <w:pPr>
+              <w:spacing w:after="0"/>
+              <w:jc w:val="right"/>
+            </w:pPr>
+            <w:r>
+              <w:rPr>
+                <w:rFonts w:ascii="Georgia" w:cs="Georgia" w:eastAsia="Georgia" w:hAnsi="Georgia"/>
+                <w:b w:val="false"/>
+                <w:bCs w:val="false"/>
+                <w:color w:val="12211E"/>
+                <w:sz w:val="19"/>
+                <w:szCs w:val="19"/>
+              </w:rPr>
+              <w:t xml:space="preserve">-2,177</w:t>
+            </w:r>
+          </w:p>
+        </w:tc>
+        <w:tc>
+          <w:tcPr>
+            <w:tcW w:type="dxa" w:w="1900"/>
+            <w:tcMar>
+              <w:top w:type="dxa" w:w="60"/>
+              <w:left w:type="dxa" w:w="100"/>
+              <w:bottom w:type="dxa" w:w="60"/>
+              <w:right w:type="dxa" w:w="100"/>
+            </w:tcMar>
+          </w:tcPr>
+          <w:p>
+            <w:pPr>
+              <w:spacing w:after="0"/>
+              <w:jc w:val="right"/>
+            </w:pPr>
+            <w:r>
+              <w:rPr>
+                <w:rFonts w:ascii="Georgia" w:cs="Georgia" w:eastAsia="Georgia" w:hAnsi="Georgia"/>
+                <w:b w:val="false"/>
+                <w:bCs w:val="false"/>
+                <w:color w:val="12211E"/>
+                <w:sz w:val="19"/>
+                <w:szCs w:val="19"/>
+              </w:rPr>
+              <w:t xml:space="preserve">-2,534</w:t>
+            </w:r>
+          </w:p>
+        </w:tc>
+        <w:tc>
+          <w:tcPr>
+            <w:tcW w:type="dxa" w:w="2000"/>
+            <w:tcMar>
+              <w:top w:type="dxa" w:w="60"/>
+              <w:left w:type="dxa" w:w="100"/>
+              <w:bottom w:type="dxa" w:w="60"/>
+              <w:right w:type="dxa" w:w="100"/>
+            </w:tcMar>
+          </w:tcPr>
+          <w:p>
+            <w:pPr>
+              <w:spacing w:after="0"/>
+              <w:jc w:val="right"/>
+            </w:pPr>
+            <w:r>
+              <w:rPr>
+                <w:rFonts w:ascii="Georgia" w:cs="Georgia" w:eastAsia="Georgia" w:hAnsi="Georgia"/>
+                <w:b w:val="false"/>
+                <w:bCs w:val="false"/>
+                <w:color w:val="12211E"/>
+                <w:sz w:val="19"/>
+                <w:szCs w:val="19"/>
+              </w:rPr>
+              <w:t xml:space="preserve">-4,268</w:t>
+            </w:r>
+          </w:p>
+        </w:tc>
+        <w:tc>
+          <w:tcPr>
+            <w:tcW w:type="dxa" w:w="1650"/>
+            <w:tcMar>
+              <w:top w:type="dxa" w:w="60"/>
+              <w:left w:type="dxa" w:w="100"/>
+              <w:bottom w:type="dxa" w:w="60"/>
+              <w:right w:type="dxa" w:w="100"/>
+            </w:tcMar>
+          </w:tcPr>
+          <w:p>
+            <w:pPr>
+              <w:spacing w:after="0"/>
+              <w:jc w:val="right"/>
+            </w:pPr>
+            <w:r>
+              <w:rPr>
+                <w:rFonts w:ascii="Georgia" w:cs="Georgia" w:eastAsia="Georgia" w:hAnsi="Georgia"/>
+                <w:b w:val="false"/>
+                <w:bCs w:val="false"/>
+                <w:color w:val="12211E"/>
+                <w:sz w:val="19"/>
+                <w:szCs w:val="19"/>
+              </w:rPr>
+              <w:t xml:space="preserve">-5,373</w:t>
+            </w:r>
+          </w:p>
+        </w:tc>
+      </w:tr>
+      <w:tr>
+        <w:tc>
+          <w:tcPr>
+            <w:tcW w:type="dxa" w:w="3100"/>
+            <w:tcMar>
+              <w:top w:type="dxa" w:w="60"/>
+              <w:left w:type="dxa" w:w="100"/>
+              <w:bottom w:type="dxa" w:w="60"/>
+              <w:right w:type="dxa" w:w="100"/>
+            </w:tcMar>
+          </w:tcPr>
+          <w:p>
+            <w:pPr>
+              <w:spacing w:after="0"/>
+              <w:jc w:val="left"/>
+            </w:pPr>
+            <w:r>
+              <w:rPr>
+                <w:rFonts w:ascii="Georgia" w:cs="Georgia" w:eastAsia="Georgia" w:hAnsi="Georgia"/>
+                <w:b w:val="false"/>
+                <w:bCs w:val="false"/>
+                <w:color w:val="12211E"/>
+                <w:sz w:val="19"/>
+                <w:szCs w:val="19"/>
+              </w:rPr>
+              <w:t xml:space="preserve">Total after discount</w:t>
+            </w:r>
+          </w:p>
+        </w:tc>
+        <w:tc>
+          <w:tcPr>
+            <w:tcW w:type="dxa" w:w="1650"/>
+            <w:tcMar>
+              <w:top w:type="dxa" w:w="60"/>
+              <w:left w:type="dxa" w:w="100"/>
+              <w:bottom w:type="dxa" w:w="60"/>
+              <w:right w:type="dxa" w:w="100"/>
+            </w:tcMar>
+          </w:tcPr>
+          <w:p>
+            <w:pPr>
+              <w:spacing w:after="0"/>
+              <w:jc w:val="right"/>
+            </w:pPr>
+            <w:r>
+              <w:rPr>
+                <w:rFonts w:ascii="Georgia" w:cs="Georgia" w:eastAsia="Georgia" w:hAnsi="Georgia"/>
+                <w:b w:val="false"/>
+                <w:bCs w:val="false"/>
+                <w:color w:val="12211E"/>
+                <w:sz w:val="19"/>
+                <w:szCs w:val="19"/>
+              </w:rPr>
+              <w:t xml:space="preserve">19,592</w:t>
+            </w:r>
+          </w:p>
+        </w:tc>
+        <w:tc>
+          <w:tcPr>
+            <w:tcW w:type="dxa" w:w="1900"/>
+            <w:tcMar>
+              <w:top w:type="dxa" w:w="60"/>
+              <w:left w:type="dxa" w:w="100"/>
+              <w:bottom w:type="dxa" w:w="60"/>
+              <w:right w:type="dxa" w:w="100"/>
+            </w:tcMar>
+          </w:tcPr>
+          <w:p>
+            <w:pPr>
+              <w:spacing w:after="0"/>
+              <w:jc w:val="right"/>
+            </w:pPr>
+            <w:r>
+              <w:rPr>
+                <w:rFonts w:ascii="Georgia" w:cs="Georgia" w:eastAsia="Georgia" w:hAnsi="Georgia"/>
+                <w:b w:val="false"/>
+                <w:bCs w:val="false"/>
+                <w:color w:val="12211E"/>
+                <w:sz w:val="19"/>
+                <w:szCs w:val="19"/>
+              </w:rPr>
+              <w:t xml:space="preserve">22,803</w:t>
+            </w:r>
+          </w:p>
+        </w:tc>
+        <w:tc>
+          <w:tcPr>
+            <w:tcW w:type="dxa" w:w="2000"/>
             <w:tcMar>
               <w:top w:type="dxa" w:w="60"/>
               <w:left w:type="dxa" w:w="100"/>
@@ -5792,29 +6386,171 @@
         </w:tc>
         <w:tc>
           <w:tcPr>
-            <w:tcW w:type="dxa" w:w="4500"/>
-            <w:tcMar>
-              <w:top w:type="dxa" w:w="60"/>
-              <w:left w:type="dxa" w:w="100"/>
-              <w:bottom w:type="dxa" w:w="60"/>
-              <w:right w:type="dxa" w:w="100"/>
-            </w:tcMar>
-          </w:tcPr>
-          <w:p>
-            <w:pPr>
-              <w:spacing w:after="0"/>
-              <w:jc w:val="right"/>
-            </w:pPr>
-            <w:r>
-              <w:rPr>
-                <w:rFonts w:ascii="Georgia" w:cs="Georgia" w:eastAsia="Georgia" w:hAnsi="Georgia"/>
-                <w:b w:val="false"/>
-                <w:bCs w:val="false"/>
-                <w:color w:val="12211E"/>
-                <w:sz w:val="19"/>
-                <w:szCs w:val="19"/>
-              </w:rPr>
-              <w:t xml:space="preserve">35.4 per share</w:t>
+            <w:tcW w:type="dxa" w:w="1650"/>
+            <w:tcMar>
+              <w:top w:type="dxa" w:w="60"/>
+              <w:left w:type="dxa" w:w="100"/>
+              <w:bottom w:type="dxa" w:w="60"/>
+              <w:right w:type="dxa" w:w="100"/>
+            </w:tcMar>
+          </w:tcPr>
+          <w:p>
+            <w:pPr>
+              <w:spacing w:after="0"/>
+              <w:jc w:val="right"/>
+            </w:pPr>
+            <w:r>
+              <w:rPr>
+                <w:rFonts w:ascii="Georgia" w:cs="Georgia" w:eastAsia="Georgia" w:hAnsi="Georgia"/>
+                <w:b w:val="false"/>
+                <w:bCs w:val="false"/>
+                <w:color w:val="12211E"/>
+                <w:sz w:val="19"/>
+                <w:szCs w:val="19"/>
+              </w:rPr>
+              <w:t xml:space="preserve">48,359</w:t>
+            </w:r>
+          </w:p>
+        </w:tc>
+      </w:tr>
+      <w:tr>
+        <w:tc>
+          <w:tcPr>
+            <w:tcW w:type="dxa" w:w="3100"/>
+            <w:tcMar>
+              <w:top w:type="dxa" w:w="60"/>
+              <w:left w:type="dxa" w:w="100"/>
+              <w:bottom w:type="dxa" w:w="60"/>
+              <w:right w:type="dxa" w:w="100"/>
+            </w:tcMar>
+          </w:tcPr>
+          <w:p>
+            <w:pPr>
+              <w:spacing w:after="0"/>
+              <w:jc w:val="left"/>
+            </w:pPr>
+            <w:r>
+              <w:rPr>
+                <w:rFonts w:ascii="Georgia" w:cs="Georgia" w:eastAsia="Georgia" w:hAnsi="Georgia"/>
+                <w:b w:val="false"/>
+                <w:bCs w:val="false"/>
+                <w:color w:val="12211E"/>
+                <w:sz w:val="19"/>
+                <w:szCs w:val="19"/>
+              </w:rPr>
+              <w:t xml:space="preserve">= per share, AFTER discount</w:t>
+            </w:r>
+          </w:p>
+        </w:tc>
+        <w:tc>
+          <w:tcPr>
+            <w:tcW w:type="dxa" w:w="1650"/>
+            <w:tcMar>
+              <w:top w:type="dxa" w:w="60"/>
+              <w:left w:type="dxa" w:w="100"/>
+              <w:bottom w:type="dxa" w:w="60"/>
+              <w:right w:type="dxa" w:w="100"/>
+            </w:tcMar>
+          </w:tcPr>
+          <w:p>
+            <w:pPr>
+              <w:spacing w:after="0"/>
+              <w:jc w:val="right"/>
+            </w:pPr>
+            <w:r>
+              <w:rPr>
+                <w:rFonts w:ascii="Georgia" w:cs="Georgia" w:eastAsia="Georgia" w:hAnsi="Georgia"/>
+                <w:b w:val="false"/>
+                <w:bCs w:val="false"/>
+                <w:color w:val="12211E"/>
+                <w:sz w:val="19"/>
+                <w:szCs w:val="19"/>
+              </w:rPr>
+              <w:t xml:space="preserve">18.0</w:t>
+            </w:r>
+          </w:p>
+        </w:tc>
+        <w:tc>
+          <w:tcPr>
+            <w:tcW w:type="dxa" w:w="1900"/>
+            <w:tcMar>
+              <w:top w:type="dxa" w:w="60"/>
+              <w:left w:type="dxa" w:w="100"/>
+              <w:bottom w:type="dxa" w:w="60"/>
+              <w:right w:type="dxa" w:w="100"/>
+            </w:tcMar>
+          </w:tcPr>
+          <w:p>
+            <w:pPr>
+              <w:spacing w:after="0"/>
+              <w:jc w:val="right"/>
+            </w:pPr>
+            <w:r>
+              <w:rPr>
+                <w:rFonts w:ascii="Georgia" w:cs="Georgia" w:eastAsia="Georgia" w:hAnsi="Georgia"/>
+                <w:b w:val="false"/>
+                <w:bCs w:val="false"/>
+                <w:color w:val="12211E"/>
+                <w:sz w:val="19"/>
+                <w:szCs w:val="19"/>
+              </w:rPr>
+              <w:t xml:space="preserve">21.0</w:t>
+            </w:r>
+          </w:p>
+        </w:tc>
+        <w:tc>
+          <w:tcPr>
+            <w:tcW w:type="dxa" w:w="2000"/>
+            <w:tcMar>
+              <w:top w:type="dxa" w:w="60"/>
+              <w:left w:type="dxa" w:w="100"/>
+              <w:bottom w:type="dxa" w:w="60"/>
+              <w:right w:type="dxa" w:w="100"/>
+            </w:tcMar>
+          </w:tcPr>
+          <w:p>
+            <w:pPr>
+              <w:spacing w:after="0"/>
+              <w:jc w:val="right"/>
+            </w:pPr>
+            <w:r>
+              <w:rPr>
+                <w:rFonts w:ascii="Georgia" w:cs="Georgia" w:eastAsia="Georgia" w:hAnsi="Georgia"/>
+                <w:b w:val="false"/>
+                <w:bCs w:val="false"/>
+                <w:color w:val="12211E"/>
+                <w:sz w:val="19"/>
+                <w:szCs w:val="19"/>
+              </w:rPr>
+              <w:t xml:space="preserve">35.4</w:t>
+            </w:r>
+          </w:p>
+        </w:tc>
+        <w:tc>
+          <w:tcPr>
+            <w:tcW w:type="dxa" w:w="1650"/>
+            <w:tcMar>
+              <w:top w:type="dxa" w:w="60"/>
+              <w:left w:type="dxa" w:w="100"/>
+              <w:bottom w:type="dxa" w:w="60"/>
+              <w:right w:type="dxa" w:w="100"/>
+            </w:tcMar>
+          </w:tcPr>
+          <w:p>
+            <w:pPr>
+              <w:spacing w:after="0"/>
+              <w:jc w:val="right"/>
+            </w:pPr>
+            <w:r>
+              <w:rPr>
+                <w:rFonts w:ascii="Georgia" w:cs="Georgia" w:eastAsia="Georgia" w:hAnsi="Georgia"/>
+                <w:b w:val="false"/>
+                <w:bCs w:val="false"/>
+                <w:color w:val="12211E"/>
+                <w:sz w:val="19"/>
+                <w:szCs w:val="19"/>
+              </w:rPr>
+              <w:t xml:space="preserve">44.6</w:t>
             </w:r>
           </w:p>
         </w:tc>
@@ -5853,7 +6589,7 @@
           <w:sz w:val="21"/>
           <w:szCs w:val="21"/>
         </w:rPr>
-        <w:t xml:space="preserve">How to read this table against the lens table below: rows A and B change ONE thing only — the MNT-Halan framing — with the car business and the lender held at their base values in both. The 'Sum of the parts' row in the lens table is a full scenario per column: its Base equals Total (B); its Bear starts from framing A and additionally stresses the operating legs (car business at 60% of its DCF value, lender at 0.8× book), which is why it sits below Total (A); its Full flexes the operating legs up (×1.4) and marks the stake at the post-second-closing round value grown to a next mark.</w:t>
+        <w:t xml:space="preserve">Column notes: Bear = framing A plus the operating legs stressed (car business at 60% of its DCF value, lender at 0.8× book). Full = operating legs flexed up (×1.4) with the stake at the post-second-closing round value grown to a next mark. The lens table below reads straight off this one: its 'Sum of the parts' row is the AFTER-discount line (Bear / Base-B / Full columns) and its 'before the discount' row is the BEFORE line (Bear column uses Base-A's before-discount figure, since the bear framing is the book value).</w:t>
       </w:r>
     </w:p>
     <w:p>
@@ -5871,7 +6607,7 @@
           <w:sz w:val="21"/>
           <w:szCs w:val="21"/>
         </w:rPr>
-        <w:t xml:space="preserve">The gap between the two framings — about 14.4 EGP per share — is the honest width of this valuation. Framing B is a real transaction price: Al Ahly Capital paid it in June 2026. Framing A is the audited book, but the auditor qualifies it every period because MNT-Halan's own statements are not made available. The base case stands on framing B; the bear case stands on framing A. In dollars, the market capitalisation (~USD 637mn) is close to the stake's round-mark value alone (~USD 601mn) — at the market price you are paying for the stake and getting the automotive and lending businesses at little value.</w:t>
+        <w:t xml:space="preserve">The gap between the two Base columns — about 14.4 EGP per share — is the honest width of this valuation. Framing B is a real transaction price; framing A is the audited book, but the auditor qualifies it every period because MNT-Halan's own statements are not made available. In dollars, the market capitalisation (~USD 637mn) is close to the stake's round-mark value alone (~USD 601mn) — at the market price you are paying for the stake and getting the automotive and lending businesses at little value.</w:t>
       </w:r>
     </w:p>
     <w:p>
@@ -6085,7 +6821,7 @@
                 <w:sz w:val="19"/>
                 <w:szCs w:val="19"/>
               </w:rPr>
-              <w:t xml:space="preserve">Sum of the parts</w:t>
+              <w:t xml:space="preserve">Sum of the parts (after 10% discount)</w:t>
             </w:r>
           </w:p>
         </w:tc>
@@ -6227,7 +6963,7 @@
                 <w:sz w:val="19"/>
                 <w:szCs w:val="19"/>
               </w:rPr>
-              <w:t xml:space="preserve">Pre-discount SOTP</w:t>
+              <w:t xml:space="preserve">Sum of the parts (before the discount)</w:t>
             </w:r>
           </w:p>
         </w:tc>

</xml_diff>